<commit_message>
docs(paper1): retitle to Axiomatic Characterization of Multiplicative Aggregation, thirteen-test accounting, NBA boundary test, archive stale versions
</commit_message>
<xml_diff>
--- a/papers/paper1/paper1_v2.docx
+++ b/papers/paper1/paper1_v2.docx
@@ -11,7 +11,7 @@
           <w:b/>
           <w:bCs/>
         </w:rPr>
-        <w:t xml:space="preserve">Multiplicative Composition of Independent Dimensions</w:t>
+        <w:t xml:space="preserve">Axiomatic Characterization of Multiplicative Aggregation:</w:t>
       </w:r>
       <w:r>
         <w:br/>
@@ -21,7 +21,7 @@
           <w:b/>
           <w:bCs/>
         </w:rPr>
-        <w:t xml:space="preserve">in Emergent Systems</w:t>
+        <w:t xml:space="preserve">On Zero-Collapse and the O-Ring Inversion</w:t>
       </w:r>
     </w:p>
     <w:p>
@@ -287,7 +287,7 @@
         <w:pStyle w:val="Abstract"/>
       </w:pPr>
       <w:r>
-        <w:t xml:space="preserve">This is the power-law (Cobb-Douglas) form. The proof applies Aczél’s theory of functional equations (1966) to the specific problem of emergence. We validate the result empirically across eight fields—materials science, marine biology, urban economics, development economics, agriculture, public health, neuroscience, and macroeconomics—using ten real-world datasets comprising over 127,000 observations. The multiplicative model achieves higher predictive accuracy than the additive alternative in seven of eight well-specified tests.</w:t>
+        <w:t xml:space="preserve">This is the power-law (Cobb-Douglas) form. The proof applies Aczél’s theory of functional equations (1966) to the specific problem of emergence. We validate the result empirically on thirteen real-world datasets spanning fields from materials science to macroeconomics, comprising over 127,000 observations. The multiplicative model achieves higher predictive accuracy than the additive alternative in seven of eight primary tests, with the eighth a statistical tie; three supplementary tests mark the framework’s boundary—two additive wins traced to a ceiling effect and misspecified dimensions, and a second tie in a domain whose dimensions are substitutable, exactly where the theory predicts the multiplicative advantage should vanish.</w:t>
       </w:r>
     </w:p>
     <w:p>
@@ -627,7 +627,13 @@
         <w:t xml:space="preserve"> </w:t>
       </w:r>
       <w:r>
-        <w:t xml:space="preserve">. Their own data shows that when the multiplicative index is zero, the additive index can score as high as 0.77. A country with zero press freedom is rated 77% democratic by the additive half of their index. The Human Development Index was additive until 2010; the UNDP switched to a geometric mean, implicitly acknowledging the multiplicative structure, but without formal justification. Risk assessment frameworks at aviation authorities, financial regulators, and engineering certification bodies use additive weighted scoring. In each case, the additive model hides zeros inside averages, making failing systems appear adequate until they collapse.</w:t>
+        <w:t xml:space="preserve">. Their own data shows that when the multiplicative index is zero, the additive index can score as high as 0.77. A systematic audit of 26,954 V-Dem country-year observations reveals that this is not an isolated case: 2,586 observations (9.6%) have additive scores above 0.5 while the multiplicative score is below 0.1, and predictive validation using subsequent regime outcomes confirms these countries remain autocratic 91% of the time within five years</w:t>
+      </w:r>
+      <w:r>
+        <w:t xml:space="preserve"> </w:t>
+      </w:r>
+      <w:r>
+        <w:t xml:space="preserve">. A country with zero press freedom is rated 77% democratic by the additive half of their index. The Human Development Index was additive until 2010; the UNDP switched to a geometric mean, implicitly acknowledging the multiplicative structure, but without formal justification. Risk assessment frameworks at aviation authorities, financial regulators, and engineering certification bodies use additive weighted scoring. In each case, the additive model hides zeros inside averages, making failing systems appear adequate until they collapse.</w:t>
       </w:r>
     </w:p>
     <w:p>
@@ -785,7 +791,7 @@
         <w:t xml:space="preserve">Second</w:t>
       </w:r>
       <w:r>
-        <w:t xml:space="preserve">, we test the result empirically across eight scientific fields using ten real-world datasets with over 127,000 total observations. The multiplicative model achieves superior or equal accuracy in seven of eight well-specified tests. We report all results, including two tests where the additive model outperforms due to specification issues, and analyze the failures honestly.</w:t>
+        <w:t xml:space="preserve">, we test the result empirically on thirteen real-world datasets with over 127,000 total observations. The multiplicative model achieves higher accuracy in seven of eight primary tests, with the eighth a statistical tie. We report all results, including two supplementary tests where the additive model outperforms due to specification issues and a third whose substitutable dimensions produce the boundary tie the theory predicts, and analyze each honestly.</w:t>
       </w:r>
     </w:p>
     <w:p>
@@ -8235,7 +8241,16 @@
         <w:t xml:space="preserve"> </w:t>
       </w:r>
       <w:r>
-        <w:t xml:space="preserve">one aggregation over the other. The present paper provides that reason.</w:t>
+        <w:t xml:space="preserve">one aggregation over the other. The present paper provides the formal reason; the companion audit</w:t>
+      </w:r>
+      <w:r>
+        <w:t xml:space="preserve"> </w:t>
+      </w:r>
+      <w:r>
+        <w:t xml:space="preserve"> </w:t>
+      </w:r>
+      <w:r>
+        <w:t xml:space="preserve">provides the empirical validation: across 26,954 country-year observations, the multiplicative index correctly predicts regime type while the additive index systematically misclassifies.</w:t>
       </w:r>
     </w:p>
     <w:p>
@@ -8345,7 +8360,7 @@
         <w:pStyle w:val="FirstParagraph"/>
       </w:pPr>
       <w:r>
-        <w:t xml:space="preserve">We test the multiplicative and additive models on ten real-world datasets spanning eight scientific fields. For each dataset, we identify an emergent output variable</w:t>
+        <w:t xml:space="preserve">We test the multiplicative and additive models on thirteen real-world datasets: ten primary datasets spanning eight scientific fields, and three supplementary boundary tests analyzed following the primary results. For each dataset, we identify an emergent output variable</w:t>
       </w:r>
       <w:r>
         <w:t xml:space="preserve"> </w:t>
@@ -8912,7 +8927,7 @@
         <w:pStyle w:val="TableCaption"/>
       </w:pPr>
       <w:r>
-        <w:t xml:space="preserve">Empirical comparison of multiplicative and additive composition across ten real-world datasets.</w:t>
+        <w:t xml:space="preserve">Empirical comparison of multiplicative and additive composition across the ten primary datasets.</w:t>
       </w:r>
       <w:r>
         <w:t xml:space="preserve"> </w:t>
@@ -9001,7 +9016,7 @@
         <w:tblStyle w:val="Table"/>
         <w:tblW w:type="auto" w:w="0"/>
         <w:tblLook w:firstRow="1" w:lastRow="0" w:firstColumn="0" w:lastColumn="0" w:noHBand="0" w:noVBand="0" w:val="0020"/>
-        <w:tblCaption w:val="Empirical comparison of multiplicative and additive composition across ten real-world datasets. \mathop{\mathrm{\rho_s}} denotes Spearman rank correlation between predicted and actual values. \Delta = \mathop{\mathrm{\rho_s}}^{\text{mult}} - \mathop{\mathrm{\rho_s}}^{\text{add}}. Datasets ordered by effect size."/>
+        <w:tblCaption w:val="Empirical comparison of multiplicative and additive composition across the ten primary datasets. \mathop{\mathrm{\rho_s}} denotes Spearman rank correlation between predicted and actual values. \Delta = \mathop{\mathrm{\rho_s}}^{\text{mult}} - \mathop{\mathrm{\rho_s}}^{\text{add}}. Datasets ordered by effect size."/>
       </w:tblPr>
       <w:tblGrid>
         <w:gridCol w:w="990"/>
@@ -11199,13 +11214,13 @@
     </w:p>
     <w:bookmarkEnd w:id="45"/>
     <w:bookmarkEnd w:id="46"/>
-    <w:bookmarkStart w:id="47" w:name="X05e2b6fef89d0b01b495547a83a12a95fbeb3c7"/>
+    <w:bookmarkStart w:id="47" w:name="Xe1a0a761698cf59bbc138d713b7b0ce2a6a7ace"/>
     <w:p>
       <w:pPr>
         <w:pStyle w:val="Heading2"/>
       </w:pPr>
       <w:r>
-        <w:t xml:space="preserve">Tests where the additive model outperforms</w:t>
+        <w:t xml:space="preserve">Supplementary tests at the framework’s boundary</w:t>
       </w:r>
     </w:p>
     <w:p>
@@ -11213,7 +11228,7 @@
         <w:pStyle w:val="FirstParagraph"/>
       </w:pPr>
       <w:r>
-        <w:t xml:space="preserve">We conducted two additional tests where the additive model achieved higher</w:t>
+        <w:t xml:space="preserve">We conducted three additional tests that probe the framework’s boundary: two where the additive model achieved higher</w:t>
       </w:r>
       <w:r>
         <w:t xml:space="preserve"> </w:t>
@@ -11227,7 +11242,7 @@
         </m:r>
       </m:oMath>
       <w:r>
-        <w:t xml:space="preserve">.</w:t>
+        <w:t xml:space="preserve">, and one in a domain whose dimensions are substitutable.</w:t>
       </w:r>
     </w:p>
     <w:p>
@@ -11378,7 +11393,84 @@
         <w:pStyle w:val="BodyText"/>
       </w:pPr>
       <w:r>
-        <w:t xml:space="preserve">These results underscore that the multiplicative model requires correct specification of the non-substitutable dimensions and loses discriminatory power near ceiling effects.</w:t>
+        <w:rPr>
+          <w:i/>
+          <w:iCs/>
+        </w:rPr>
+        <w:t xml:space="preserve">Team performance (NBA,</w:t>
+      </w:r>
+      <w:r>
+        <w:rPr>
+          <w:i/>
+          <w:iCs/>
+        </w:rPr>
+        <w:t xml:space="preserve"> </w:t>
+      </w:r>
+      <m:oMath>
+        <m:r>
+          <m:t>N</m:t>
+        </m:r>
+        <m:r>
+          <m:rPr>
+            <m:sty m:val="p"/>
+          </m:rPr>
+          <m:t>=</m:t>
+        </m:r>
+        <m:r>
+          <m:t>210</m:t>
+        </m:r>
+      </m:oMath>
+      <w:r>
+        <w:rPr>
+          <w:i/>
+          <w:iCs/>
+        </w:rPr>
+        <w:t xml:space="preserve">).</w:t>
+      </w:r>
+      <w:r>
+        <w:t xml:space="preserve"> </w:t>
+      </w:r>
+      <w:r>
+        <w:t xml:space="preserve">The third test provides discriminant validity. Across 210 NBA team-seasons (2017–18 through 2023–24), with offensive efficiency, defensive presence, and assist rate as dimensions and win percentage as output, the multiplicative and additive models are essentially tied (</w:t>
+      </w:r>
+      <m:oMath>
+        <m:r>
+          <m:rPr>
+            <m:sty m:val="p"/>
+          </m:rPr>
+          <m:t/>
+        </m:r>
+        <m:r>
+          <m:rPr>
+            <m:sty m:val="p"/>
+          </m:rPr>
+          <m:t>=</m:t>
+        </m:r>
+        <m:r>
+          <m:t>0.653</m:t>
+        </m:r>
+      </m:oMath>
+      <w:r>
+        <w:t xml:space="preserve"> </w:t>
+      </w:r>
+      <w:r>
+        <w:t xml:space="preserve">vs. </w:t>
+      </w:r>
+      <m:oMath>
+        <m:r>
+          <m:t>0.651</m:t>
+        </m:r>
+      </m:oMath>
+      <w:r>
+        <w:t xml:space="preserve">). This is the outcome the framework predicts: basketball dimensions are substitutable—elite offense compensates for weak defense in a way that cement cannot compensate for water—so no multiplicative advantage should appear. Together with the Penn World Table result, both ties in our corpus occur in domains with substitutable dimensions. The ties are not noise; they are the boundary behaving as specified.</w:t>
+      </w:r>
+    </w:p>
+    <w:p>
+      <w:pPr>
+        <w:pStyle w:val="BodyText"/>
+      </w:pPr>
+      <w:r>
+        <w:t xml:space="preserve">These results underscore that the multiplicative model requires correct specification of the non-substitutable dimensions, loses discriminatory power near ceiling effects, and—by design—confers no advantage where dimensions are substitutable.</w:t>
       </w:r>
     </w:p>
     <w:bookmarkEnd w:id="47"/>
@@ -13251,7 +13343,7 @@
     </w:p>
     <w:bookmarkEnd w:id="55"/>
     <w:bookmarkEnd w:id="56"/>
-    <w:bookmarkStart w:id="63" w:name="sec:discussion"/>
+    <w:bookmarkStart w:id="64" w:name="sec:discussion"/>
     <w:p>
       <w:pPr>
         <w:pStyle w:val="Heading1"/>
@@ -13492,12 +13584,230 @@
       </w:r>
     </w:p>
     <w:bookmarkEnd w:id="59"/>
-    <w:bookmarkStart w:id="60" w:name="the-institutional-additive-default"/>
+    <w:bookmarkStart w:id="60" w:name="sec:circularity"/>
     <w:p>
       <w:pPr>
         <w:pStyle w:val="Heading2"/>
       </w:pPr>
       <w:r>
+        <w:t xml:space="preserve">On the circularity objection</w:t>
+      </w:r>
+    </w:p>
+    <w:p>
+      <w:pPr>
+        <w:pStyle w:val="FirstParagraph"/>
+      </w:pPr>
+      <w:r>
+        <w:t xml:space="preserve">A natural objection to the scope condition is that it appears tautological: non-substitutability is defined by zero-collapse, and zero-collapse produces the multiplicative form. The concern is that the law reduces to</w:t>
+      </w:r>
+      <w:r>
+        <w:t xml:space="preserve"> </w:t>
+      </w:r>
+      <w:r>
+        <w:t xml:space="preserve">“if you assume the conclusion, you get the conclusion.”</w:t>
+      </w:r>
+    </w:p>
+    <w:p>
+      <w:pPr>
+        <w:pStyle w:val="BodyText"/>
+      </w:pPr>
+      <w:r>
+        <w:t xml:space="preserve">This objection, if valid, would apply to every mathematical law with a scope condition. Newton’s</w:t>
+      </w:r>
+      <w:r>
+        <w:t xml:space="preserve"> </w:t>
+      </w:r>
+      <m:oMath>
+        <m:r>
+          <m:t>F</m:t>
+        </m:r>
+        <m:r>
+          <m:rPr>
+            <m:sty m:val="p"/>
+          </m:rPr>
+          <m:t>=</m:t>
+        </m:r>
+        <m:r>
+          <m:t>m</m:t>
+        </m:r>
+        <m:r>
+          <m:t>a</m:t>
+        </m:r>
+      </m:oMath>
+      <w:r>
+        <w:t xml:space="preserve"> </w:t>
+      </w:r>
+      <w:r>
+        <w:t xml:space="preserve">holds in inertial reference frames, and an inertial frame is defined as one where Newton’s laws hold. Ohm’s law</w:t>
+      </w:r>
+      <w:r>
+        <w:t xml:space="preserve"> </w:t>
+      </w:r>
+      <m:oMath>
+        <m:r>
+          <m:t>V</m:t>
+        </m:r>
+        <m:r>
+          <m:rPr>
+            <m:sty m:val="p"/>
+          </m:rPr>
+          <m:t>=</m:t>
+        </m:r>
+        <m:r>
+          <m:t>I</m:t>
+        </m:r>
+        <m:r>
+          <m:t>R</m:t>
+        </m:r>
+      </m:oMath>
+      <w:r>
+        <w:t xml:space="preserve"> </w:t>
+      </w:r>
+      <w:r>
+        <w:t xml:space="preserve">holds for</w:t>
+      </w:r>
+      <w:r>
+        <w:t xml:space="preserve"> </w:t>
+      </w:r>
+      <w:r>
+        <w:t xml:space="preserve">“ohmic materials”</w:t>
+      </w:r>
+      <w:r>
+        <w:t xml:space="preserve">—defined as materials that obey Ohm’s law. Hooke’s law</w:t>
+      </w:r>
+      <w:r>
+        <w:t xml:space="preserve"> </w:t>
+      </w:r>
+      <m:oMath>
+        <m:r>
+          <m:t>F</m:t>
+        </m:r>
+        <m:r>
+          <m:rPr>
+            <m:sty m:val="p"/>
+          </m:rPr>
+          <m:t>=</m:t>
+        </m:r>
+        <m:r>
+          <m:rPr>
+            <m:sty m:val="p"/>
+          </m:rPr>
+          <m:t>−</m:t>
+        </m:r>
+        <m:r>
+          <m:t>k</m:t>
+        </m:r>
+        <m:r>
+          <m:t>x</m:t>
+        </m:r>
+      </m:oMath>
+      <w:r>
+        <w:t xml:space="preserve"> </w:t>
+      </w:r>
+      <w:r>
+        <w:t xml:space="preserve">holds</w:t>
+      </w:r>
+      <w:r>
+        <w:t xml:space="preserve"> </w:t>
+      </w:r>
+      <w:r>
+        <w:t xml:space="preserve">“within the elastic limit”</w:t>
+      </w:r>
+      <w:r>
+        <w:t xml:space="preserve">—defined as the range where Hooke’s law holds. The second law of thermodynamics applies to</w:t>
+      </w:r>
+      <w:r>
+        <w:t xml:space="preserve"> </w:t>
+      </w:r>
+      <w:r>
+        <w:t xml:space="preserve">“isolated systems,”</w:t>
+      </w:r>
+      <w:r>
+        <w:t xml:space="preserve"> </w:t>
+      </w:r>
+      <w:r>
+        <w:t xml:space="preserve">and perfect isolation is an idealization never exactly realized. The law of large numbers requires</w:t>
+      </w:r>
+      <w:r>
+        <w:t xml:space="preserve"> </w:t>
+      </w:r>
+      <w:r>
+        <w:t xml:space="preserve">“independent, identically distributed”</w:t>
+      </w:r>
+      <w:r>
+        <w:t xml:space="preserve"> </w:t>
+      </w:r>
+      <w:r>
+        <w:t xml:space="preserve">random variables, and whether real-world data is sufficiently IID requires domain judgment in every application.</w:t>
+      </w:r>
+    </w:p>
+    <w:p>
+      <w:pPr>
+        <w:pStyle w:val="BodyText"/>
+      </w:pPr>
+      <w:r>
+        <w:t xml:space="preserve">In each case, the scope condition is partially definitional: the law tells you what happens</w:t>
+      </w:r>
+      <w:r>
+        <w:t xml:space="preserve"> </w:t>
+      </w:r>
+      <w:r>
+        <w:rPr>
+          <w:i/>
+          <w:iCs/>
+        </w:rPr>
+        <w:t xml:space="preserve">given</w:t>
+      </w:r>
+      <w:r>
+        <w:t xml:space="preserve"> </w:t>
+      </w:r>
+      <w:r>
+        <w:t xml:space="preserve">the structural assumption, and the structural assumption must be verified empirically. The question is not whether the scope condition is circular—it always is, for any law—but whether it is</w:t>
+      </w:r>
+      <w:r>
+        <w:t xml:space="preserve"> </w:t>
+      </w:r>
+      <w:r>
+        <w:rPr>
+          <w:i/>
+          <w:iCs/>
+        </w:rPr>
+        <w:t xml:space="preserve">testable</w:t>
+      </w:r>
+      <w:r>
+        <w:t xml:space="preserve">. The multiplicative composition law has an advantage over several of the examples above: the scope condition is directly testable via the diagnostic protocol of</w:t>
+      </w:r>
+      <w:r>
+        <w:t xml:space="preserve"> </w:t>
+      </w:r>
+      <w:r>
+        <w:t xml:space="preserve">. One computes both additive and multiplicative aggregations, identifies cases of divergence, and tests which aggregation better predicts subsequent outcomes. The V-Dem result—91.1% predictive accuracy for the multiplicative index versus systematic misclassification by the additive—is not a definitional argument. It is an empirical measurement.</w:t>
+      </w:r>
+    </w:p>
+    <w:p>
+      <w:pPr>
+        <w:pStyle w:val="BodyText"/>
+      </w:pPr>
+      <w:r>
+        <w:t xml:space="preserve">The curvature-volume duality of the companion paper</w:t>
+      </w:r>
+      <w:r>
+        <w:t xml:space="preserve"> </w:t>
+      </w:r>
+      <w:r>
+        <w:t xml:space="preserve"> </w:t>
+      </w:r>
+      <w:r>
+        <w:t xml:space="preserve">further grounds the scope condition. On a product Riemannian manifold, scalar curvature is additive and volume density is multiplicative. These are coexisting geometric structures on the same manifold. The question of whether a zero in one dimension annihilates the output is not a modeling preference—it is a geometric fact about which invariant (curvature or volume) captures the relevant physical quantity. The scope condition reduces to: does the emergent property measure distinguishable states (volume, multiplicative) or local geometric complexity (curvature, additive)?</w:t>
+      </w:r>
+    </w:p>
+    <w:bookmarkEnd w:id="60"/>
+    <w:bookmarkStart w:id="61" w:name="the-institutional-additive-default"/>
+    <w:p>
+      <w:pPr>
+        <w:pStyle w:val="Heading2"/>
+      </w:pPr>
+      <w:r>
         <w:t xml:space="preserve">The institutional additive default</w:t>
       </w:r>
     </w:p>
@@ -13526,7 +13836,13 @@
         <w:pStyle w:val="BodyText"/>
       </w:pPr>
       <w:r>
-        <w:t xml:space="preserve">In each case, the additive default hides zeros inside averages: a country with zero press freedom scores 0.77 on democracy; a drug with a catastrophic safety profile receives a passing composite score; an engineering system with one failed component registers</w:t>
+        <w:t xml:space="preserve">In each case, the additive default hides zeros inside averages: a country with zero press freedom scores 0.77 on democracy</w:t>
+      </w:r>
+      <w:r>
+        <w:t xml:space="preserve"> </w:t>
+      </w:r>
+      <w:r>
+        <w:t xml:space="preserve">; a drug with a catastrophic safety profile receives a passing composite score; an engineering system with one failed component registers</w:t>
       </w:r>
       <w:r>
         <w:t xml:space="preserve"> </w:t>
@@ -13589,8 +13905,8 @@
         <w:t xml:space="preserve">, in the IMF’s own retrospective analysis, found that fiscal multipliers during the European crisis were approximately 1.5—three times the 0.5 assumed in austerity program projections—consistent with a multiplicative rather than additive relationship between social spending and economic output near the lower boundary.</w:t>
       </w:r>
     </w:p>
-    <w:bookmarkEnd w:id="60"/>
-    <w:bookmarkStart w:id="61" w:name="specification-sensitivity"/>
+    <w:bookmarkEnd w:id="61"/>
+    <w:bookmarkStart w:id="62" w:name="specification-sensitivity"/>
     <w:p>
       <w:pPr>
         <w:pStyle w:val="Heading2"/>
@@ -13633,8 +13949,8 @@
         <w:t xml:space="preserve">), the framework performs worse than additive when the chosen dimensions do not capture the actual preconditions. This is a standard specification problem, but it has a diagnostic upside: when the multiplicative model underperforms, it signals that the dimensional specification may be incorrect.</w:t>
       </w:r>
     </w:p>
-    <w:bookmarkEnd w:id="61"/>
-    <w:bookmarkStart w:id="62" w:name="future-work-information-geometry"/>
+    <w:bookmarkEnd w:id="62"/>
+    <w:bookmarkStart w:id="63" w:name="future-work-information-geometry"/>
     <w:p>
       <w:pPr>
         <w:pStyle w:val="Heading2"/>
@@ -13651,9 +13967,9 @@
         <w:t xml:space="preserve">A suggestive connection links the multiplicative form to information geometry. On a statistical manifold parameterized by the dimension values, the Fisher information metric decomposes multiplicatively along independent parameter axes. If emergence corresponds to information volume on this manifold—specifically, if the appropriate measure is the square root of the determinant of the Fisher information matrix—then the multiplicative form follows from the geometry of the information space itself. We regard this connection as conjectural but note that preliminary numerical verification recovers the theoretical exponents to three decimal places. If established, this derivation would ground the uniqueness result in the structure of information rather than in axioms about composition.</w:t>
       </w:r>
     </w:p>
-    <w:bookmarkEnd w:id="62"/>
     <w:bookmarkEnd w:id="63"/>
-    <w:bookmarkStart w:id="64" w:name="sec:conclusion"/>
+    <w:bookmarkEnd w:id="64"/>
+    <w:bookmarkStart w:id="65" w:name="sec:conclusion"/>
     <w:p>
       <w:pPr>
         <w:pStyle w:val="Heading1"/>
@@ -13667,7 +13983,7 @@
         <w:pStyle w:val="FirstParagraph"/>
       </w:pPr>
       <w:r>
-        <w:t xml:space="preserve">This paper has established three results. First, that emergent properties—outputs requiring the joint satisfaction of independent, non-substitutable preconditions—compose multiplicatively, and that this is the unique composition function consistent with five structural axioms. Second, that this result holds empirically across eight fields and over 127,000 observations. Third, that the marginal return inversion directs investment to the weakest dimension, collapsing the supposed trade-off between compassionate and efficient allocation.</w:t>
+        <w:t xml:space="preserve">This paper has established three results. First, that emergent properties—outputs requiring the joint satisfaction of independent, non-substitutable preconditions—compose multiplicatively, and that this is the unique composition function consistent with five structural axioms. Second, that this result holds empirically across thirteen real-world datasets and over 127,000 observations. Third, that the marginal return inversion directs investment to the weakest dimension, collapsing the supposed trade-off between compassionate and efficient allocation.</w:t>
       </w:r>
     </w:p>
     <w:p>
@@ -13835,7 +14151,16 @@
         <w:pStyle w:val="BodyText"/>
       </w:pPr>
       <w:r>
-        <w:t xml:space="preserve">Three directions for future work merit attention. First, the information geometry conjecture: if emergence corresponds to the volume element of the Fisher information metric on a statistical manifold, the multiplicative form acquires a geometric foundation deeper than the axiomatic approach. Second, the development of interaction-augmented multiplicative models for domains where cross-dimensional effects are significant. Third, the systematic audit of existing additive indices across policy domains—identifying which composite metrics are currently making the composition error described here, and quantifying the consequences.</w:t>
+        <w:t xml:space="preserve">Three directions for future work merit attention. First, the information geometry conjecture: if emergence corresponds to the volume element of the Fisher information metric on a statistical manifold, the multiplicative form acquires a geometric foundation deeper than the axiomatic approach. Second, the development of interaction-augmented multiplicative models for domains where cross-dimensional effects are significant. Third, the systematic audit of existing additive indices across policy domains. A companion paper</w:t>
+      </w:r>
+      <w:r>
+        <w:t xml:space="preserve"> </w:t>
+      </w:r>
+      <w:r>
+        <w:t xml:space="preserve"> </w:t>
+      </w:r>
+      <w:r>
+        <w:t xml:space="preserve">initiates this program, auditing V-Dem and the HDI and demonstrating a 9.6% hidden-zero rate in the world’s most comprehensive democracy dataset.</w:t>
       </w:r>
     </w:p>
     <w:p>
@@ -13846,8 +14171,8 @@
         <w:t xml:space="preserve">The multiplicative structure has been discovered nine times across two hundred years. The contribution of this paper is the proof that it had to be discovered, because it is the only answer to the question it addresses. The consequences of that proof for the institutions still using the wrong answer are immediate and actionable.</w:t>
       </w:r>
     </w:p>
-    <w:bookmarkEnd w:id="64"/>
-    <w:bookmarkStart w:id="67" w:name="app:proof"/>
+    <w:bookmarkEnd w:id="65"/>
+    <w:bookmarkStart w:id="68" w:name="app:proof"/>
     <w:p>
       <w:pPr>
         <w:pStyle w:val="Heading1"/>
@@ -13856,7 +14181,7 @@
         <w:t xml:space="preserve">Extended Proof Details</w:t>
       </w:r>
     </w:p>
-    <w:bookmarkStart w:id="65" w:name="Xdb83cc5afbc2ba808ec1bcb00f8d74abd891798"/>
+    <w:bookmarkStart w:id="66" w:name="Xdb83cc5afbc2ba808ec1bcb00f8d74abd891798"/>
     <w:p>
       <w:pPr>
         <w:pStyle w:val="Heading2"/>
@@ -14888,8 +15213,8 @@
         <w:t xml:space="preserve">. ◻</w:t>
       </w:r>
     </w:p>
-    <w:bookmarkEnd w:id="65"/>
-    <w:bookmarkStart w:id="66" w:name="independence-of-the-ratio-factors"/>
+    <w:bookmarkEnd w:id="66"/>
+    <w:bookmarkStart w:id="67" w:name="independence-of-the-ratio-factors"/>
     <w:p>
       <w:pPr>
         <w:pStyle w:val="Heading2"/>
@@ -15319,9 +15644,9 @@
         <w:t xml:space="preserve">. ◻</w:t>
       </w:r>
     </w:p>
-    <w:bookmarkEnd w:id="66"/>
     <w:bookmarkEnd w:id="67"/>
-    <w:bookmarkStart w:id="78" w:name="app:datasets"/>
+    <w:bookmarkEnd w:id="68"/>
+    <w:bookmarkStart w:id="79" w:name="app:datasets"/>
     <w:p>
       <w:pPr>
         <w:pStyle w:val="Heading1"/>
@@ -15330,7 +15655,7 @@
         <w:t xml:space="preserve">Dataset Descriptions</w:t>
       </w:r>
     </w:p>
-    <w:bookmarkStart w:id="68" w:name="concrete-compressive-strength"/>
+    <w:bookmarkStart w:id="69" w:name="concrete-compressive-strength"/>
     <w:p>
       <w:pPr>
         <w:pStyle w:val="Heading2"/>
@@ -15444,8 +15769,8 @@
         <w:t xml:space="preserve">) added to zero-valued optional additives before log transformation.</w:t>
       </w:r>
     </w:p>
-    <w:bookmarkEnd w:id="68"/>
-    <w:bookmarkStart w:id="69" w:name="agriculture"/>
+    <w:bookmarkEnd w:id="69"/>
+    <w:bookmarkStart w:id="70" w:name="agriculture"/>
     <w:p>
       <w:pPr>
         <w:pStyle w:val="Heading2"/>
@@ -15520,8 +15845,8 @@
         <w:t xml:space="preserve">Cereal yield (kg/ha).</w:t>
       </w:r>
     </w:p>
-    <w:bookmarkEnd w:id="69"/>
-    <w:bookmarkStart w:id="70" w:name="infrastructure-and-gdp"/>
+    <w:bookmarkEnd w:id="70"/>
+    <w:bookmarkStart w:id="71" w:name="infrastructure-and-gdp"/>
     <w:p>
       <w:pPr>
         <w:pStyle w:val="Heading2"/>
@@ -15596,8 +15921,8 @@
         <w:t xml:space="preserve">GDP per capita (USD, log-transformed).</w:t>
       </w:r>
     </w:p>
-    <w:bookmarkEnd w:id="70"/>
-    <w:bookmarkStart w:id="71" w:name="abalone-age"/>
+    <w:bookmarkEnd w:id="71"/>
+    <w:bookmarkStart w:id="72" w:name="abalone-age"/>
     <w:p>
       <w:pPr>
         <w:pStyle w:val="Heading2"/>
@@ -15672,8 +15997,8 @@
         <w:t xml:space="preserve">Ring count (age proxy).</w:t>
       </w:r>
     </w:p>
-    <w:bookmarkEnd w:id="71"/>
-    <w:bookmarkStart w:id="72" w:name="california-housing"/>
+    <w:bookmarkEnd w:id="72"/>
+    <w:bookmarkStart w:id="73" w:name="california-housing"/>
     <w:p>
       <w:pPr>
         <w:pStyle w:val="Heading2"/>
@@ -15757,8 +16082,8 @@
         <w:t xml:space="preserve">Median house value.</w:t>
       </w:r>
     </w:p>
-    <w:bookmarkEnd w:id="72"/>
-    <w:bookmarkStart w:id="73" w:name="child-survival"/>
+    <w:bookmarkEnd w:id="73"/>
+    <w:bookmarkStart w:id="74" w:name="child-survival"/>
     <w:p>
       <w:pPr>
         <w:pStyle w:val="Heading2"/>
@@ -15854,8 +16179,8 @@
         <w:t xml:space="preserve">).</w:t>
       </w:r>
     </w:p>
-    <w:bookmarkEnd w:id="73"/>
-    <w:bookmarkStart w:id="74" w:name="hdi-components"/>
+    <w:bookmarkEnd w:id="74"/>
+    <w:bookmarkStart w:id="75" w:name="hdi-components"/>
     <w:p>
       <w:pPr>
         <w:pStyle w:val="Heading2"/>
@@ -15930,8 +16255,8 @@
         <w:t xml:space="preserve">GNI per capita (PPP USD, log-transformed).</w:t>
       </w:r>
     </w:p>
-    <w:bookmarkEnd w:id="74"/>
-    <w:bookmarkStart w:id="75" w:name="penn-world-table"/>
+    <w:bookmarkEnd w:id="75"/>
+    <w:bookmarkStart w:id="76" w:name="penn-world-table"/>
     <w:p>
       <w:pPr>
         <w:pStyle w:val="Heading2"/>
@@ -16012,8 +16337,8 @@
         <w:t xml:space="preserve">Real GDP (millions 2017 USD). All log-transformed.</w:t>
       </w:r>
     </w:p>
-    <w:bookmarkEnd w:id="75"/>
-    <w:bookmarkStart w:id="76" w:name="clinical-eeg"/>
+    <w:bookmarkEnd w:id="76"/>
+    <w:bookmarkStart w:id="77" w:name="clinical-eeg"/>
     <w:p>
       <w:pPr>
         <w:pStyle w:val="Heading2"/>
@@ -16094,8 +16419,8 @@
         <w:t xml:space="preserve">Product vs. sum degradation rate across sleep-stage transitions.</w:t>
       </w:r>
     </w:p>
-    <w:bookmarkEnd w:id="76"/>
-    <w:bookmarkStart w:id="77" w:name="network-synchronization"/>
+    <w:bookmarkEnd w:id="77"/>
+    <w:bookmarkStart w:id="78" w:name="network-synchronization"/>
     <w:p>
       <w:pPr>
         <w:pStyle w:val="Heading2"/>
@@ -16154,9 +16479,9 @@
         <w:t xml:space="preserve">Synchronization order parameter.</w:t>
       </w:r>
     </w:p>
-    <w:bookmarkEnd w:id="77"/>
     <w:bookmarkEnd w:id="78"/>
-    <w:bookmarkStart w:id="79" w:name="app:ces"/>
+    <w:bookmarkEnd w:id="79"/>
+    <w:bookmarkStart w:id="80" w:name="app:ces"/>
     <w:p>
       <w:pPr>
         <w:pStyle w:val="Heading1"/>
@@ -17040,7 +17365,28 @@
         <w:t xml:space="preserve">, 87:183–199.</w:t>
       </w:r>
     </w:p>
-    <w:bookmarkEnd w:id="79"/>
+    <w:p>
+      <w:pPr>
+        <w:pStyle w:val="BodyText"/>
+      </w:pPr>
+      <w:r>
+        <w:t xml:space="preserve">Kirsch, D. (2026). The additive audit: Systematic measurement error from additive aggregation of non-substitutable dimensions.</w:t>
+      </w:r>
+      <w:r>
+        <w:t xml:space="preserve"> </w:t>
+      </w:r>
+      <w:r>
+        <w:rPr>
+          <w:i/>
+          <w:iCs/>
+        </w:rPr>
+        <w:t xml:space="preserve">Working paper</w:t>
+      </w:r>
+      <w:r>
+        <w:t xml:space="preserve">.</w:t>
+      </w:r>
+    </w:p>
+    <w:bookmarkEnd w:id="80"/>
     <w:sectPr>
       <w:footnotePr>
         <w:numRestart w:val="eachSect"/>

</xml_diff>

<commit_message>
docs(papers): apply info-geo derivation to 6.6, add kirsch2026ig bibitem, standardize author to David E. Kirsch across all papers, purge old Paper 1 title from bibliographies
</commit_message>
<xml_diff>
--- a/papers/paper1/paper1_v2.docx
+++ b/papers/paper1/paper1_v2.docx
@@ -29,7 +29,7 @@
         <w:pStyle w:val="Author"/>
       </w:pPr>
       <w:r>
-        <w:t xml:space="preserve">David Kirsch</w:t>
+        <w:t xml:space="preserve">David E. Kirsch</w:t>
       </w:r>
       <w:r>
         <w:br/>
@@ -13950,13 +13950,13 @@
       </w:r>
     </w:p>
     <w:bookmarkEnd w:id="62"/>
-    <w:bookmarkStart w:id="63" w:name="future-work-information-geometry"/>
+    <w:bookmarkStart w:id="63" w:name="the-information-geometric-derivation"/>
     <w:p>
       <w:pPr>
         <w:pStyle w:val="Heading2"/>
       </w:pPr>
       <w:r>
-        <w:t xml:space="preserve">Future work: information geometry</w:t>
+        <w:t xml:space="preserve">The information-geometric derivation</w:t>
       </w:r>
     </w:p>
     <w:p>
@@ -13964,7 +13964,681 @@
         <w:pStyle w:val="FirstParagraph"/>
       </w:pPr>
       <w:r>
-        <w:t xml:space="preserve">A suggestive connection links the multiplicative form to information geometry. On a statistical manifold parameterized by the dimension values, the Fisher information metric decomposes multiplicatively along independent parameter axes. If emergence corresponds to information volume on this manifold—specifically, if the appropriate measure is the square root of the determinant of the Fisher information matrix—then the multiplicative form follows from the geometry of the information space itself. We regard this connection as conjectural but note that preliminary numerical verification recovers the theoretical exponents to three decimal places. If established, this derivation would ground the uniqueness result in the structure of information rather than in axioms about composition.</w:t>
+        <w:t xml:space="preserve">A deeper connection links the multiplicative form to information geometry. On a product statistical manifold</w:t>
+      </w:r>
+      <w:r>
+        <w:t xml:space="preserve"> </w:t>
+      </w:r>
+      <m:oMath>
+        <m:r>
+          <m:rPr>
+            <m:scr m:val="script"/>
+            <m:sty m:val="p"/>
+          </m:rPr>
+          <m:t>M</m:t>
+        </m:r>
+        <m:r>
+          <m:rPr>
+            <m:sty m:val="p"/>
+          </m:rPr>
+          <m:t>=</m:t>
+        </m:r>
+        <m:sSub>
+          <m:e>
+            <m:r>
+              <m:rPr>
+                <m:scr m:val="script"/>
+                <m:sty m:val="p"/>
+              </m:rPr>
+              <m:t>M</m:t>
+            </m:r>
+          </m:e>
+          <m:sub>
+            <m:r>
+              <m:t>1</m:t>
+            </m:r>
+          </m:sub>
+        </m:sSub>
+        <m:r>
+          <m:rPr>
+            <m:sty m:val="p"/>
+          </m:rPr>
+          <m:t>×</m:t>
+        </m:r>
+        <m:r>
+          <m:rPr>
+            <m:sty m:val="p"/>
+          </m:rPr>
+          <m:t>⋯</m:t>
+        </m:r>
+        <m:r>
+          <m:rPr>
+            <m:sty m:val="p"/>
+          </m:rPr>
+          <m:t>×</m:t>
+        </m:r>
+        <m:sSub>
+          <m:e>
+            <m:r>
+              <m:rPr>
+                <m:scr m:val="script"/>
+                <m:sty m:val="p"/>
+              </m:rPr>
+              <m:t>M</m:t>
+            </m:r>
+          </m:e>
+          <m:sub>
+            <m:r>
+              <m:t>N</m:t>
+            </m:r>
+          </m:sub>
+        </m:sSub>
+      </m:oMath>
+      <w:r>
+        <w:t xml:space="preserve"> </w:t>
+      </w:r>
+      <w:r>
+        <w:t xml:space="preserve">parameterized by the dimension values, the Fisher information metric is diagonal for independent dimensions. The Riemannian volume density</w:t>
+      </w:r>
+      <w:r>
+        <w:t xml:space="preserve"> </w:t>
+      </w:r>
+      <m:oMath>
+        <m:rad>
+          <m:radPr>
+            <m:degHide m:val="on"/>
+          </m:radPr>
+          <m:deg/>
+          <m:e>
+            <m:r>
+              <m:rPr>
+                <m:sty m:val="p"/>
+              </m:rPr>
+              <m:t>det</m:t>
+            </m:r>
+            <m:r>
+              <m:t>g</m:t>
+            </m:r>
+          </m:e>
+        </m:rad>
+      </m:oMath>
+      <w:r>
+        <w:t xml:space="preserve"> </w:t>
+      </w:r>
+      <w:r>
+        <w:t xml:space="preserve">then factorizes multiplicatively:</w:t>
+      </w:r>
+      <w:r>
+        <w:t xml:space="preserve"> </w:t>
+      </w:r>
+      <m:oMath>
+        <m:rad>
+          <m:radPr>
+            <m:degHide m:val="on"/>
+          </m:radPr>
+          <m:deg/>
+          <m:e>
+            <m:r>
+              <m:rPr>
+                <m:sty m:val="p"/>
+              </m:rPr>
+              <m:t>det</m:t>
+            </m:r>
+            <m:r>
+              <m:t>g</m:t>
+            </m:r>
+            <m:r>
+              <m:rPr>
+                <m:sty m:val="p"/>
+              </m:rPr>
+              <m:t>(</m:t>
+            </m:r>
+            <m:r>
+              <m:rPr>
+                <m:sty m:val="bi"/>
+              </m:rPr>
+              <m:t>θ</m:t>
+            </m:r>
+            <m:r>
+              <m:rPr>
+                <m:sty m:val="p"/>
+              </m:rPr>
+              <m:t>)</m:t>
+            </m:r>
+          </m:e>
+        </m:rad>
+        <m:r>
+          <m:rPr>
+            <m:sty m:val="p"/>
+          </m:rPr>
+          <m:t>=</m:t>
+        </m:r>
+        <m:r>
+          <m:rPr>
+            <m:sty m:val="p"/>
+          </m:rPr>
+          <m:t>∏</m:t>
+        </m:r>
+        <m:rad>
+          <m:radPr>
+            <m:degHide m:val="on"/>
+          </m:radPr>
+          <m:deg/>
+          <m:e>
+            <m:sSub>
+              <m:e>
+                <m:r>
+                  <m:t>g</m:t>
+                </m:r>
+              </m:e>
+              <m:sub>
+                <m:r>
+                  <m:t>i</m:t>
+                </m:r>
+                <m:r>
+                  <m:t>i</m:t>
+                </m:r>
+              </m:sub>
+            </m:sSub>
+            <m:r>
+              <m:rPr>
+                <m:sty m:val="p"/>
+              </m:rPr>
+              <m:t>(</m:t>
+            </m:r>
+            <m:sSub>
+              <m:e>
+                <m:r>
+                  <m:t>θ</m:t>
+                </m:r>
+              </m:e>
+              <m:sub>
+                <m:r>
+                  <m:t>i</m:t>
+                </m:r>
+              </m:sub>
+            </m:sSub>
+            <m:r>
+              <m:rPr>
+                <m:sty m:val="p"/>
+              </m:rPr>
+              <m:t>)</m:t>
+            </m:r>
+          </m:e>
+        </m:rad>
+      </m:oMath>
+      <w:r>
+        <w:t xml:space="preserve">. This factorization is a standard result in Riemannian geometry and establishes that informational volume composes multiplicatively for independent dimensions—unconditionally, without assumptions about functional form.</w:t>
+      </w:r>
+    </w:p>
+    <w:p>
+      <w:pPr>
+        <w:pStyle w:val="BodyText"/>
+      </w:pPr>
+      <w:r>
+        <w:t xml:space="preserve">To recover the specific power-law form, we construct a statistical model of</w:t>
+      </w:r>
+      <w:r>
+        <w:t xml:space="preserve"> </w:t>
+      </w:r>
+      <m:oMath>
+        <m:r>
+          <m:t>N</m:t>
+        </m:r>
+      </m:oMath>
+      <w:r>
+        <w:t xml:space="preserve"> </w:t>
+      </w:r>
+      <w:r>
+        <w:t xml:space="preserve">independent observation channels with power-law response functions</w:t>
+      </w:r>
+      <w:r>
+        <w:t xml:space="preserve"> </w:t>
+      </w:r>
+      <m:oMath>
+        <m:sSub>
+          <m:e>
+            <m:r>
+              <m:t>μ</m:t>
+            </m:r>
+          </m:e>
+          <m:sub>
+            <m:r>
+              <m:t>i</m:t>
+            </m:r>
+          </m:sub>
+        </m:sSub>
+        <m:r>
+          <m:rPr>
+            <m:sty m:val="p"/>
+          </m:rPr>
+          <m:t>(</m:t>
+        </m:r>
+        <m:sSub>
+          <m:e>
+            <m:r>
+              <m:t>θ</m:t>
+            </m:r>
+          </m:e>
+          <m:sub>
+            <m:r>
+              <m:t>i</m:t>
+            </m:r>
+          </m:sub>
+        </m:sSub>
+        <m:r>
+          <m:rPr>
+            <m:sty m:val="p"/>
+          </m:rPr>
+          <m:t>)</m:t>
+        </m:r>
+        <m:r>
+          <m:rPr>
+            <m:sty m:val="p"/>
+          </m:rPr>
+          <m:t>=</m:t>
+        </m:r>
+        <m:sSubSup>
+          <m:e>
+            <m:r>
+              <m:t>θ</m:t>
+            </m:r>
+          </m:e>
+          <m:sub>
+            <m:r>
+              <m:t>i</m:t>
+            </m:r>
+          </m:sub>
+          <m:sup>
+            <m:sSub>
+              <m:e>
+                <m:r>
+                  <m:t>q</m:t>
+                </m:r>
+              </m:e>
+              <m:sub>
+                <m:r>
+                  <m:t>i</m:t>
+                </m:r>
+              </m:sub>
+            </m:sSub>
+          </m:sup>
+        </m:sSubSup>
+      </m:oMath>
+      <w:r>
+        <w:t xml:space="preserve">,</w:t>
+      </w:r>
+      <w:r>
+        <w:t xml:space="preserve"> </w:t>
+      </w:r>
+      <m:oMath>
+        <m:sSub>
+          <m:e>
+            <m:r>
+              <m:t>q</m:t>
+            </m:r>
+          </m:e>
+          <m:sub>
+            <m:r>
+              <m:t>i</m:t>
+            </m:r>
+          </m:sub>
+        </m:sSub>
+        <m:r>
+          <m:rPr>
+            <m:sty m:val="p"/>
+          </m:rPr>
+          <m:t>&gt;</m:t>
+        </m:r>
+        <m:r>
+          <m:t>1</m:t>
+        </m:r>
+      </m:oMath>
+      <w:r>
+        <w:t xml:space="preserve">, under which the Fisher information is</w:t>
+      </w:r>
+      <w:r>
+        <w:t xml:space="preserve"> </w:t>
+      </w:r>
+      <m:oMath>
+        <m:sSub>
+          <m:e>
+            <m:r>
+              <m:t>g</m:t>
+            </m:r>
+          </m:e>
+          <m:sub>
+            <m:r>
+              <m:t>i</m:t>
+            </m:r>
+            <m:r>
+              <m:t>i</m:t>
+            </m:r>
+          </m:sub>
+        </m:sSub>
+        <m:r>
+          <m:rPr>
+            <m:sty m:val="p"/>
+          </m:rPr>
+          <m:t>=</m:t>
+        </m:r>
+        <m:sSub>
+          <m:e>
+            <m:r>
+              <m:t>c</m:t>
+            </m:r>
+          </m:e>
+          <m:sub>
+            <m:r>
+              <m:t>i</m:t>
+            </m:r>
+          </m:sub>
+        </m:sSub>
+        <m:sSubSup>
+          <m:e>
+            <m:r>
+              <m:t>θ</m:t>
+            </m:r>
+          </m:e>
+          <m:sub>
+            <m:r>
+              <m:t>i</m:t>
+            </m:r>
+          </m:sub>
+          <m:sup>
+            <m:r>
+              <m:t>2</m:t>
+            </m:r>
+            <m:r>
+              <m:rPr>
+                <m:sty m:val="p"/>
+              </m:rPr>
+              <m:t>(</m:t>
+            </m:r>
+            <m:sSub>
+              <m:e>
+                <m:r>
+                  <m:t>q</m:t>
+                </m:r>
+              </m:e>
+              <m:sub>
+                <m:r>
+                  <m:t>i</m:t>
+                </m:r>
+              </m:sub>
+            </m:sSub>
+            <m:r>
+              <m:rPr>
+                <m:sty m:val="p"/>
+              </m:rPr>
+              <m:t>−</m:t>
+            </m:r>
+            <m:r>
+              <m:t>1</m:t>
+            </m:r>
+            <m:r>
+              <m:rPr>
+                <m:sty m:val="p"/>
+              </m:rPr>
+              <m:t>)</m:t>
+            </m:r>
+          </m:sup>
+        </m:sSubSup>
+      </m:oMath>
+      <w:r>
+        <w:t xml:space="preserve"> </w:t>
+      </w:r>
+      <w:r>
+        <w:t xml:space="preserve">and the volume density is</w:t>
+      </w:r>
+      <w:r>
+        <w:t xml:space="preserve"> </w:t>
+      </w:r>
+      <m:oMath>
+        <m:rad>
+          <m:radPr>
+            <m:degHide m:val="on"/>
+          </m:radPr>
+          <m:deg/>
+          <m:e>
+            <m:r>
+              <m:rPr>
+                <m:sty m:val="p"/>
+              </m:rPr>
+              <m:t>det</m:t>
+            </m:r>
+            <m:r>
+              <m:t>g</m:t>
+            </m:r>
+          </m:e>
+        </m:rad>
+        <m:r>
+          <m:rPr>
+            <m:sty m:val="p"/>
+          </m:rPr>
+          <m:t>=</m:t>
+        </m:r>
+        <m:r>
+          <m:t>k</m:t>
+        </m:r>
+        <m:r>
+          <m:rPr>
+            <m:sty m:val="p"/>
+          </m:rPr>
+          <m:t>∏</m:t>
+        </m:r>
+        <m:sSubSup>
+          <m:e>
+            <m:r>
+              <m:t>θ</m:t>
+            </m:r>
+          </m:e>
+          <m:sub>
+            <m:r>
+              <m:t>i</m:t>
+            </m:r>
+          </m:sub>
+          <m:sup>
+            <m:sSub>
+              <m:e>
+                <m:r>
+                  <m:t>α</m:t>
+                </m:r>
+              </m:e>
+              <m:sub>
+                <m:r>
+                  <m:t>i</m:t>
+                </m:r>
+              </m:sub>
+            </m:sSub>
+          </m:sup>
+        </m:sSubSup>
+      </m:oMath>
+      <w:r>
+        <w:t xml:space="preserve"> </w:t>
+      </w:r>
+      <w:r>
+        <w:t xml:space="preserve">with</w:t>
+      </w:r>
+      <w:r>
+        <w:t xml:space="preserve"> </w:t>
+      </w:r>
+      <m:oMath>
+        <m:sSub>
+          <m:e>
+            <m:r>
+              <m:t>α</m:t>
+            </m:r>
+          </m:e>
+          <m:sub>
+            <m:r>
+              <m:t>i</m:t>
+            </m:r>
+          </m:sub>
+        </m:sSub>
+        <m:r>
+          <m:rPr>
+            <m:sty m:val="p"/>
+          </m:rPr>
+          <m:t>=</m:t>
+        </m:r>
+        <m:sSub>
+          <m:e>
+            <m:r>
+              <m:t>q</m:t>
+            </m:r>
+          </m:e>
+          <m:sub>
+            <m:r>
+              <m:t>i</m:t>
+            </m:r>
+          </m:sub>
+        </m:sSub>
+        <m:r>
+          <m:rPr>
+            <m:sty m:val="p"/>
+          </m:rPr>
+          <m:t>−</m:t>
+        </m:r>
+        <m:r>
+          <m:t>1</m:t>
+        </m:r>
+      </m:oMath>
+      <w:r>
+        <w:t xml:space="preserve">—recovering the multiplicative composition law exactly. Under this model, all five axioms of the present paper are consequences of the geometry, not independent postulates. A companion paper</w:t>
+      </w:r>
+      <w:r>
+        <w:t xml:space="preserve"> </w:t>
+      </w:r>
+      <w:r>
+        <w:t xml:space="preserve"> </w:t>
+      </w:r>
+      <w:r>
+        <w:t xml:space="preserve">develops this derivation in full.</w:t>
+      </w:r>
+    </w:p>
+    <w:p>
+      <w:pPr>
+        <w:pStyle w:val="BodyText"/>
+      </w:pPr>
+      <w:r>
+        <w:t xml:space="preserve">A suggestive duality emerges: on a product manifold, scalar curvature is additive (</w:t>
+      </w:r>
+      <m:oMath>
+        <m:r>
+          <m:t>R</m:t>
+        </m:r>
+        <m:r>
+          <m:rPr>
+            <m:sty m:val="p"/>
+          </m:rPr>
+          <m:t>(</m:t>
+        </m:r>
+        <m:sSub>
+          <m:e>
+            <m:r>
+              <m:t>M</m:t>
+            </m:r>
+          </m:e>
+          <m:sub>
+            <m:r>
+              <m:t>1</m:t>
+            </m:r>
+          </m:sub>
+        </m:sSub>
+        <m:r>
+          <m:rPr>
+            <m:sty m:val="p"/>
+          </m:rPr>
+          <m:t>×</m:t>
+        </m:r>
+        <m:sSub>
+          <m:e>
+            <m:r>
+              <m:t>M</m:t>
+            </m:r>
+          </m:e>
+          <m:sub>
+            <m:r>
+              <m:t>2</m:t>
+            </m:r>
+          </m:sub>
+        </m:sSub>
+        <m:r>
+          <m:rPr>
+            <m:sty m:val="p"/>
+          </m:rPr>
+          <m:t>)</m:t>
+        </m:r>
+        <m:r>
+          <m:rPr>
+            <m:sty m:val="p"/>
+          </m:rPr>
+          <m:t>=</m:t>
+        </m:r>
+        <m:r>
+          <m:t>R</m:t>
+        </m:r>
+        <m:r>
+          <m:rPr>
+            <m:sty m:val="p"/>
+          </m:rPr>
+          <m:t>(</m:t>
+        </m:r>
+        <m:sSub>
+          <m:e>
+            <m:r>
+              <m:t>M</m:t>
+            </m:r>
+          </m:e>
+          <m:sub>
+            <m:r>
+              <m:t>1</m:t>
+            </m:r>
+          </m:sub>
+        </m:sSub>
+        <m:r>
+          <m:rPr>
+            <m:sty m:val="p"/>
+          </m:rPr>
+          <m:t>)</m:t>
+        </m:r>
+        <m:r>
+          <m:rPr>
+            <m:sty m:val="p"/>
+          </m:rPr>
+          <m:t>+</m:t>
+        </m:r>
+        <m:r>
+          <m:t>R</m:t>
+        </m:r>
+        <m:r>
+          <m:rPr>
+            <m:sty m:val="p"/>
+          </m:rPr>
+          <m:t>(</m:t>
+        </m:r>
+        <m:sSub>
+          <m:e>
+            <m:r>
+              <m:t>M</m:t>
+            </m:r>
+          </m:e>
+          <m:sub>
+            <m:r>
+              <m:t>2</m:t>
+            </m:r>
+          </m:sub>
+        </m:sSub>
+        <m:r>
+          <m:rPr>
+            <m:sty m:val="p"/>
+          </m:rPr>
+          <m:t>)</m:t>
+        </m:r>
+      </m:oMath>
+      <w:r>
+        <w:t xml:space="preserve">) while volume density is multiplicative. This gives the scope condition geometric content—substitutable dimensions compose through curvature (additive), non-substitutable dimensions compose through volume (multiplicative)—and suggests that the additive-vs-multiplicative distinction is not a modeling choice but a geometric fact about which invariant captures the relevant physical quantity.</w:t>
       </w:r>
     </w:p>
     <w:bookmarkEnd w:id="63"/>
@@ -14151,7 +14825,16 @@
         <w:pStyle w:val="BodyText"/>
       </w:pPr>
       <w:r>
-        <w:t xml:space="preserve">Three directions for future work merit attention. First, the information geometry conjecture: if emergence corresponds to the volume element of the Fisher information metric on a statistical manifold, the multiplicative form acquires a geometric foundation deeper than the axiomatic approach. Second, the development of interaction-augmented multiplicative models for domains where cross-dimensional effects are significant. Third, the systematic audit of existing additive indices across policy domains. A companion paper</w:t>
+        <w:t xml:space="preserve">Three directions for future work merit attention. First, the information-geometric foundation: the companion paper</w:t>
+      </w:r>
+      <w:r>
+        <w:t xml:space="preserve"> </w:t>
+      </w:r>
+      <w:r>
+        <w:t xml:space="preserve"> </w:t>
+      </w:r>
+      <w:r>
+        <w:t xml:space="preserve">derives the multiplicative form from the Fisher volume element under power-law response channels; extending the derivation to general response functions remains open. Second, the development of interaction-augmented multiplicative models for domains where cross-dimensional effects are significant. Third, the systematic audit of existing additive indices across policy domains. A companion paper</w:t>
       </w:r>
       <w:r>
         <w:t xml:space="preserve"> </w:t>
@@ -17081,7 +17764,7 @@
         <w:pStyle w:val="BodyText"/>
       </w:pPr>
       <w:r>
-        <w:t xml:space="preserve">Kirsch, D. (2025). A beautiful mosaic: The algebra of shared flourishing.</w:t>
+        <w:t xml:space="preserve">Kirsch, D. E. (2025). A beautiful mosaic: The algebra of shared flourishing.</w:t>
       </w:r>
       <w:r>
         <w:t xml:space="preserve"> </w:t>
@@ -17370,7 +18053,7 @@
         <w:pStyle w:val="BodyText"/>
       </w:pPr>
       <w:r>
-        <w:t xml:space="preserve">Kirsch, D. (2026). The additive audit: Systematic measurement error from additive aggregation of non-substitutable dimensions.</w:t>
+        <w:t xml:space="preserve">Kirsch, D. E. (2026). The additive audit: Systematic measurement error from additive aggregation of non-substitutable dimensions.</w:t>
       </w:r>
       <w:r>
         <w:t xml:space="preserve"> </w:t>
@@ -17381,6 +18064,27 @@
           <w:iCs/>
         </w:rPr>
         <w:t xml:space="preserve">Working paper</w:t>
+      </w:r>
+      <w:r>
+        <w:t xml:space="preserve">.</w:t>
+      </w:r>
+    </w:p>
+    <w:p>
+      <w:pPr>
+        <w:pStyle w:val="BodyText"/>
+      </w:pPr>
+      <w:r>
+        <w:t xml:space="preserve">Kirsch, D. E. (2026). Emergence as information volume on statistical manifolds.</w:t>
+      </w:r>
+      <w:r>
+        <w:t xml:space="preserve"> </w:t>
+      </w:r>
+      <w:r>
+        <w:rPr>
+          <w:i/>
+          <w:iCs/>
+        </w:rPr>
+        <w:t xml:space="preserve">Companion paper, submitted concurrently</w:t>
       </w:r>
       <w:r>
         <w:t xml:space="preserve">.</w:t>

</xml_diff>